<commit_message>
uploaded class 9 lecture
</commit_message>
<xml_diff>
--- a/Github tutorial.docx
+++ b/Github tutorial.docx
@@ -83,87 +83,35 @@
           <w:b/>
           <w:sz w:val="36"/>
         </w:rPr>
-        <w:t xml:space="preserve">What is </w:t>
-      </w:r>
-      <w:proofErr w:type="spellStart"/>
-      <w:r>
+        <w:t>What is Github?</w:t>
+      </w:r>
+    </w:p>
+    <w:p>
+      <w:pPr>
+        <w:rPr>
+          <w:sz w:val="24"/>
+        </w:rPr>
+      </w:pPr>
+      <w:r>
+        <w:rPr>
+          <w:sz w:val="24"/>
+        </w:rPr>
+        <w:t>Github is an online cloud-based platform where people store, share, and work together on computer code.</w:t>
+      </w:r>
+    </w:p>
+    <w:p>
+      <w:pPr>
         <w:rPr>
           <w:b/>
           <w:sz w:val="36"/>
         </w:rPr>
-        <w:t>Github</w:t>
-      </w:r>
-      <w:proofErr w:type="spellEnd"/>
+      </w:pPr>
       <w:r>
         <w:rPr>
           <w:b/>
           <w:sz w:val="36"/>
         </w:rPr>
-        <w:t>?</w:t>
-      </w:r>
-    </w:p>
-    <w:p>
-      <w:pPr>
-        <w:rPr>
-          <w:sz w:val="24"/>
-        </w:rPr>
-      </w:pPr>
-      <w:proofErr w:type="spellStart"/>
-      <w:r>
-        <w:rPr>
-          <w:sz w:val="24"/>
-        </w:rPr>
-        <w:t>Github</w:t>
-      </w:r>
-      <w:proofErr w:type="spellEnd"/>
-      <w:r>
-        <w:rPr>
-          <w:sz w:val="24"/>
-        </w:rPr>
-        <w:t xml:space="preserve"> is </w:t>
-      </w:r>
-      <w:r>
-        <w:rPr>
-          <w:sz w:val="24"/>
-        </w:rPr>
-        <w:t>an online cloud-based platform where people store, share, and work together on computer code</w:t>
-      </w:r>
-      <w:r>
-        <w:rPr>
-          <w:sz w:val="24"/>
-        </w:rPr>
-        <w:t>.</w:t>
-      </w:r>
-    </w:p>
-    <w:p>
-      <w:pPr>
-        <w:rPr>
-          <w:b/>
-          <w:sz w:val="36"/>
-        </w:rPr>
-      </w:pPr>
-      <w:r>
-        <w:rPr>
-          <w:b/>
-          <w:sz w:val="36"/>
-        </w:rPr>
-        <w:t xml:space="preserve">What is </w:t>
-      </w:r>
-      <w:proofErr w:type="spellStart"/>
-      <w:r>
-        <w:rPr>
-          <w:b/>
-          <w:sz w:val="36"/>
-        </w:rPr>
-        <w:t>Git</w:t>
-      </w:r>
-      <w:proofErr w:type="spellEnd"/>
-      <w:r>
-        <w:rPr>
-          <w:b/>
-          <w:sz w:val="36"/>
-        </w:rPr>
-        <w:t>?</w:t>
+        <w:t>What is Git?</w:t>
       </w:r>
     </w:p>
     <w:p>
@@ -173,7 +121,6 @@
         </w:rPr>
       </w:pPr>
       <w:hyperlink r:id="rId6" w:tgtFrame="_blank" w:history="1">
-        <w:proofErr w:type="spellStart"/>
         <w:r>
           <w:rPr>
             <w:rStyle w:val="Hyperlink"/>
@@ -182,7 +129,6 @@
           </w:rPr>
           <w:t>Git</w:t>
         </w:r>
-        <w:proofErr w:type="spellEnd"/>
       </w:hyperlink>
       <w:r>
         <w:rPr>
@@ -192,39 +138,13 @@
           <w:bCs/>
           <w:sz w:val="24"/>
         </w:rPr>
-        <w:t xml:space="preserve"> is a</w:t>
-      </w:r>
-      <w:r>
-        <w:rPr>
-          <w:rStyle w:val="inqyif"/>
-          <w:rFonts w:ascii="Arial" w:hAnsi="Arial" w:cs="Arial"/>
-          <w:b/>
-          <w:bCs/>
-          <w:sz w:val="24"/>
-        </w:rPr>
-        <w:t xml:space="preserve"> free, open-source distributed Version Control S</w:t>
-      </w:r>
-      <w:r>
-        <w:rPr>
-          <w:rStyle w:val="inqyif"/>
-          <w:rFonts w:ascii="Arial" w:hAnsi="Arial" w:cs="Arial"/>
-          <w:b/>
-          <w:bCs/>
-          <w:sz w:val="24"/>
-        </w:rPr>
-        <w:t>ystem</w:t>
-      </w:r>
-      <w:r>
-        <w:rPr>
-          <w:sz w:val="24"/>
-        </w:rPr>
-        <w:t xml:space="preserve"> designed to track changes in source code and files over time</w:t>
-      </w:r>
-      <w:r>
-        <w:rPr>
-          <w:sz w:val="24"/>
-        </w:rPr>
-        <w:t>.</w:t>
+        <w:t xml:space="preserve"> is a free, open-source distributed Version Control System</w:t>
+      </w:r>
+      <w:r>
+        <w:rPr>
+          <w:sz w:val="24"/>
+        </w:rPr>
+        <w:t xml:space="preserve"> designed to track changes in source code and files over time.</w:t>
       </w:r>
     </w:p>
     <w:p>
@@ -244,49 +164,13 @@
           <w:sz w:val="24"/>
         </w:rPr>
       </w:pPr>
-      <w:proofErr w:type="spellStart"/>
-      <w:r>
-        <w:rPr>
-          <w:b/>
-          <w:i/>
-          <w:sz w:val="24"/>
-        </w:rPr>
-        <w:t>Github</w:t>
-      </w:r>
-      <w:proofErr w:type="spellEnd"/>
-      <w:r>
-        <w:rPr>
-          <w:b/>
-          <w:i/>
-          <w:sz w:val="24"/>
-        </w:rPr>
-        <w:t xml:space="preserve"> </w:t>
-      </w:r>
-      <w:r>
-        <w:rPr>
-          <w:b/>
-          <w:i/>
-          <w:sz w:val="24"/>
-        </w:rPr>
-        <w:t xml:space="preserve">uses a system called </w:t>
-      </w:r>
-      <w:proofErr w:type="spellStart"/>
-      <w:r>
-        <w:rPr>
-          <w:b/>
-          <w:i/>
-          <w:sz w:val="24"/>
-        </w:rPr>
-        <w:t>Git</w:t>
-      </w:r>
-      <w:proofErr w:type="spellEnd"/>
-      <w:r>
-        <w:rPr>
-          <w:b/>
-          <w:i/>
-          <w:sz w:val="24"/>
-        </w:rPr>
-        <w:t xml:space="preserve"> to track every change made to a file</w:t>
+      <w:r>
+        <w:rPr>
+          <w:b/>
+          <w:i/>
+          <w:sz w:val="24"/>
+        </w:rPr>
+        <w:t>Github uses a system called Git to track every change made to a file</w:t>
       </w:r>
     </w:p>
     <w:p/>
@@ -294,58 +178,37 @@
     <w:p/>
     <w:p/>
     <w:p/>
-    <w:p>
-      <w:bookmarkStart w:id="0" w:name="_GoBack"/>
-      <w:bookmarkEnd w:id="0"/>
-    </w:p>
     <w:p/>
-    <w:p>
-      <w:pPr>
-        <w:rPr>
-          <w:b/>
-          <w:sz w:val="24"/>
-        </w:rPr>
-      </w:pPr>
-      <w:r>
-        <w:rPr>
-          <w:b/>
-          <w:sz w:val="24"/>
-        </w:rPr>
-        <w:t xml:space="preserve">STEP 0: Create your account on </w:t>
-      </w:r>
-      <w:proofErr w:type="spellStart"/>
-      <w:r>
-        <w:rPr>
-          <w:b/>
-          <w:sz w:val="24"/>
-        </w:rPr>
-        <w:t>Github</w:t>
-      </w:r>
-      <w:proofErr w:type="spellEnd"/>
-    </w:p>
-    <w:p>
-      <w:pPr>
-        <w:rPr>
-          <w:b/>
-          <w:sz w:val="24"/>
-        </w:rPr>
-      </w:pPr>
-      <w:r>
-        <w:rPr>
-          <w:b/>
-          <w:sz w:val="24"/>
-        </w:rPr>
-        <w:t xml:space="preserve">STEP 1: Installing </w:t>
-      </w:r>
-      <w:proofErr w:type="spellStart"/>
-      <w:r>
-        <w:rPr>
-          <w:b/>
-          <w:sz w:val="24"/>
-        </w:rPr>
-        <w:t>Git</w:t>
-      </w:r>
-      <w:proofErr w:type="spellEnd"/>
+    <w:p/>
+    <w:p>
+      <w:pPr>
+        <w:rPr>
+          <w:b/>
+          <w:sz w:val="24"/>
+        </w:rPr>
+      </w:pPr>
+      <w:r>
+        <w:rPr>
+          <w:b/>
+          <w:sz w:val="24"/>
+        </w:rPr>
+        <w:t>STEP 0: Create your account on Github</w:t>
+      </w:r>
+    </w:p>
+    <w:p>
+      <w:pPr>
+        <w:rPr>
+          <w:b/>
+          <w:sz w:val="24"/>
+        </w:rPr>
+      </w:pPr>
+      <w:r>
+        <w:rPr>
+          <w:b/>
+          <w:sz w:val="24"/>
+        </w:rPr>
+        <w:t>STEP 1: Installing Git</w:t>
+      </w:r>
     </w:p>
     <w:p>
       <w:pPr>
@@ -396,23 +259,7 @@
           <w:b/>
           <w:sz w:val="24"/>
         </w:rPr>
-        <w:t xml:space="preserve"> </w:t>
-      </w:r>
-      <w:proofErr w:type="spellStart"/>
-      <w:r>
-        <w:rPr>
-          <w:b/>
-          <w:sz w:val="24"/>
-        </w:rPr>
-        <w:t>Github</w:t>
-      </w:r>
-      <w:proofErr w:type="spellEnd"/>
-      <w:r>
-        <w:rPr>
-          <w:b/>
-          <w:sz w:val="24"/>
-        </w:rPr>
-        <w:t xml:space="preserve"> Credentials (if required)</w:t>
+        <w:t xml:space="preserve"> Github Credentials (if required)</w:t>
       </w:r>
     </w:p>
     <w:p>
@@ -456,19 +303,11 @@
           <w:sz w:val="24"/>
         </w:rPr>
       </w:pPr>
-      <w:proofErr w:type="spellStart"/>
-      <w:r>
-        <w:rPr>
-          <w:sz w:val="24"/>
-        </w:rPr>
-        <w:t>Goto</w:t>
-      </w:r>
-      <w:proofErr w:type="spellEnd"/>
-      <w:r>
-        <w:rPr>
-          <w:sz w:val="24"/>
-        </w:rPr>
-        <w:t xml:space="preserve"> Windows Credential </w:t>
+      <w:r>
+        <w:rPr>
+          <w:sz w:val="24"/>
+        </w:rPr>
+        <w:t xml:space="preserve">Goto Windows Credential </w:t>
       </w:r>
     </w:p>
     <w:p>
@@ -488,21 +327,12 @@
         </w:rPr>
         <w:t xml:space="preserve">In Generic Credential, check </w:t>
       </w:r>
-      <w:proofErr w:type="spellStart"/>
       <w:r>
         <w:rPr>
           <w:color w:val="0070C0"/>
           <w:sz w:val="24"/>
         </w:rPr>
-        <w:t>git:https</w:t>
-      </w:r>
-      <w:proofErr w:type="spellEnd"/>
-      <w:r>
-        <w:rPr>
-          <w:color w:val="0070C0"/>
-          <w:sz w:val="24"/>
-        </w:rPr>
-        <w:t xml:space="preserve">://github.com </w:t>
+        <w:t xml:space="preserve">git:https://github.com </w:t>
       </w:r>
       <w:r>
         <w:rPr>
@@ -658,23 +488,7 @@
           <w:b/>
           <w:sz w:val="24"/>
         </w:rPr>
-        <w:t xml:space="preserve">STEP 3: </w:t>
-      </w:r>
-      <w:proofErr w:type="spellStart"/>
-      <w:r>
-        <w:rPr>
-          <w:b/>
-          <w:sz w:val="24"/>
-        </w:rPr>
-        <w:t>Git</w:t>
-      </w:r>
-      <w:proofErr w:type="spellEnd"/>
-      <w:r>
-        <w:rPr>
-          <w:b/>
-          <w:sz w:val="24"/>
-        </w:rPr>
-        <w:t xml:space="preserve"> CONFIGURATION on Local Machine</w:t>
+        <w:t>STEP 3: Git CONFIGURATION on Local Machine</w:t>
       </w:r>
     </w:p>
     <w:p>
@@ -710,59 +524,25 @@
         <w:rPr>
           <w:sz w:val="24"/>
         </w:rPr>
-        <w:t xml:space="preserve">Check </w:t>
-      </w:r>
-      <w:proofErr w:type="spellStart"/>
-      <w:r>
-        <w:rPr>
-          <w:sz w:val="24"/>
-        </w:rPr>
-        <w:t>Git</w:t>
-      </w:r>
-      <w:proofErr w:type="spellEnd"/>
-      <w:r>
-        <w:rPr>
-          <w:sz w:val="24"/>
-        </w:rPr>
-        <w:t xml:space="preserve"> version using command </w:t>
-      </w:r>
-    </w:p>
-    <w:p>
-      <w:pPr>
-        <w:pStyle w:val="ListParagraph"/>
-        <w:rPr>
-          <w:b/>
-          <w:i/>
-          <w:sz w:val="24"/>
-        </w:rPr>
-      </w:pPr>
-      <w:r>
-        <w:rPr>
-          <w:b/>
-          <w:i/>
-          <w:sz w:val="24"/>
-        </w:rPr>
-        <w:t xml:space="preserve">&gt;&gt; </w:t>
-      </w:r>
-      <w:proofErr w:type="spellStart"/>
-      <w:proofErr w:type="gramStart"/>
-      <w:r>
-        <w:rPr>
-          <w:b/>
-          <w:i/>
-          <w:sz w:val="24"/>
-        </w:rPr>
-        <w:t>git</w:t>
-      </w:r>
-      <w:proofErr w:type="spellEnd"/>
-      <w:proofErr w:type="gramEnd"/>
-      <w:r>
-        <w:rPr>
-          <w:b/>
-          <w:i/>
-          <w:sz w:val="24"/>
-        </w:rPr>
-        <w:t xml:space="preserve"> –version</w:t>
+        <w:t xml:space="preserve">Check Git version using command </w:t>
+      </w:r>
+    </w:p>
+    <w:p>
+      <w:pPr>
+        <w:pStyle w:val="ListParagraph"/>
+        <w:rPr>
+          <w:b/>
+          <w:i/>
+          <w:sz w:val="24"/>
+        </w:rPr>
+      </w:pPr>
+      <w:r>
+        <w:rPr>
+          <w:b/>
+          <w:i/>
+          <w:sz w:val="24"/>
+        </w:rPr>
+        <w:t>&gt;&gt; git –version</w:t>
       </w:r>
     </w:p>
     <w:p>
@@ -798,63 +578,7 @@
           <w:i/>
           <w:sz w:val="24"/>
         </w:rPr>
-        <w:t xml:space="preserve">&gt;&gt; </w:t>
-      </w:r>
-      <w:proofErr w:type="spellStart"/>
-      <w:proofErr w:type="gramStart"/>
-      <w:r>
-        <w:rPr>
-          <w:b/>
-          <w:i/>
-          <w:sz w:val="24"/>
-        </w:rPr>
-        <w:t>git</w:t>
-      </w:r>
-      <w:proofErr w:type="spellEnd"/>
-      <w:proofErr w:type="gramEnd"/>
-      <w:r>
-        <w:rPr>
-          <w:b/>
-          <w:i/>
-          <w:sz w:val="24"/>
-        </w:rPr>
-        <w:t xml:space="preserve"> </w:t>
-      </w:r>
-      <w:proofErr w:type="spellStart"/>
-      <w:r>
-        <w:rPr>
-          <w:b/>
-          <w:i/>
-          <w:sz w:val="24"/>
-        </w:rPr>
-        <w:t>config</w:t>
-      </w:r>
-      <w:proofErr w:type="spellEnd"/>
-      <w:r>
-        <w:rPr>
-          <w:b/>
-          <w:i/>
-          <w:sz w:val="24"/>
-        </w:rPr>
-        <w:t xml:space="preserve"> --global user.name "&lt;</w:t>
-      </w:r>
-      <w:proofErr w:type="spellStart"/>
-      <w:r>
-        <w:rPr>
-          <w:b/>
-          <w:i/>
-          <w:sz w:val="24"/>
-        </w:rPr>
-        <w:t>github</w:t>
-      </w:r>
-      <w:proofErr w:type="spellEnd"/>
-      <w:r>
-        <w:rPr>
-          <w:b/>
-          <w:i/>
-          <w:sz w:val="24"/>
-        </w:rPr>
-        <w:t xml:space="preserve"> user name should be there&gt;"</w:t>
+        <w:t>&gt;&gt; git config --global user.name "&lt;github user name should be there&gt;"</w:t>
       </w:r>
     </w:p>
     <w:p>
@@ -890,81 +614,7 @@
           <w:i/>
           <w:sz w:val="24"/>
         </w:rPr>
-        <w:t xml:space="preserve">&gt;&gt; </w:t>
-      </w:r>
-      <w:proofErr w:type="spellStart"/>
-      <w:proofErr w:type="gramStart"/>
-      <w:r>
-        <w:rPr>
-          <w:b/>
-          <w:i/>
-          <w:sz w:val="24"/>
-        </w:rPr>
-        <w:t>git</w:t>
-      </w:r>
-      <w:proofErr w:type="spellEnd"/>
-      <w:proofErr w:type="gramEnd"/>
-      <w:r>
-        <w:rPr>
-          <w:b/>
-          <w:i/>
-          <w:sz w:val="24"/>
-        </w:rPr>
-        <w:t xml:space="preserve"> </w:t>
-      </w:r>
-      <w:proofErr w:type="spellStart"/>
-      <w:r>
-        <w:rPr>
-          <w:b/>
-          <w:i/>
-          <w:sz w:val="24"/>
-        </w:rPr>
-        <w:t>config</w:t>
-      </w:r>
-      <w:proofErr w:type="spellEnd"/>
-      <w:r>
-        <w:rPr>
-          <w:b/>
-          <w:i/>
-          <w:sz w:val="24"/>
-        </w:rPr>
-        <w:t xml:space="preserve"> --global </w:t>
-      </w:r>
-      <w:proofErr w:type="spellStart"/>
-      <w:r>
-        <w:rPr>
-          <w:b/>
-          <w:i/>
-          <w:sz w:val="24"/>
-        </w:rPr>
-        <w:t>user.email</w:t>
-      </w:r>
-      <w:proofErr w:type="spellEnd"/>
-      <w:r>
-        <w:rPr>
-          <w:b/>
-          <w:i/>
-          <w:sz w:val="24"/>
-        </w:rPr>
-        <w:t xml:space="preserve"> "&lt;your email of </w:t>
-      </w:r>
-      <w:proofErr w:type="spellStart"/>
-      <w:r>
-        <w:rPr>
-          <w:b/>
-          <w:i/>
-          <w:sz w:val="24"/>
-        </w:rPr>
-        <w:t>github</w:t>
-      </w:r>
-      <w:proofErr w:type="spellEnd"/>
-      <w:r>
-        <w:rPr>
-          <w:b/>
-          <w:i/>
-          <w:sz w:val="24"/>
-        </w:rPr>
-        <w:t>&gt;"</w:t>
+        <w:t>&gt;&gt; git config --global user.email "&lt;your email of github&gt;"</w:t>
       </w:r>
     </w:p>
     <w:p>
@@ -1087,43 +737,7 @@
           <w:i/>
           <w:sz w:val="24"/>
         </w:rPr>
-        <w:t xml:space="preserve">&gt;&gt; </w:t>
-      </w:r>
-      <w:proofErr w:type="spellStart"/>
-      <w:r>
-        <w:rPr>
-          <w:b/>
-          <w:i/>
-          <w:sz w:val="24"/>
-        </w:rPr>
-        <w:t>git</w:t>
-      </w:r>
-      <w:proofErr w:type="spellEnd"/>
-      <w:r>
-        <w:rPr>
-          <w:b/>
-          <w:i/>
-          <w:sz w:val="24"/>
-        </w:rPr>
-        <w:t xml:space="preserve"> </w:t>
-      </w:r>
-      <w:proofErr w:type="spellStart"/>
-      <w:r>
-        <w:rPr>
-          <w:b/>
-          <w:i/>
-          <w:sz w:val="24"/>
-        </w:rPr>
-        <w:t>config</w:t>
-      </w:r>
-      <w:proofErr w:type="spellEnd"/>
-      <w:r>
-        <w:rPr>
-          <w:b/>
-          <w:i/>
-          <w:sz w:val="24"/>
-        </w:rPr>
-        <w:t xml:space="preserve"> --global user.name</w:t>
+        <w:t>&gt;&gt; git config --global user.name</w:t>
       </w:r>
     </w:p>
     <w:p>
@@ -1145,54 +759,8 @@
           <w:i/>
           <w:sz w:val="24"/>
         </w:rPr>
-        <w:t xml:space="preserve">&gt;&gt; </w:t>
-      </w:r>
-      <w:proofErr w:type="spellStart"/>
-      <w:r>
-        <w:rPr>
-          <w:b/>
-          <w:i/>
-          <w:sz w:val="24"/>
-        </w:rPr>
-        <w:t>git</w:t>
-      </w:r>
-      <w:proofErr w:type="spellEnd"/>
-      <w:r>
-        <w:rPr>
-          <w:b/>
-          <w:i/>
-          <w:sz w:val="24"/>
-        </w:rPr>
-        <w:t xml:space="preserve"> </w:t>
-      </w:r>
-      <w:proofErr w:type="spellStart"/>
-      <w:r>
-        <w:rPr>
-          <w:b/>
-          <w:i/>
-          <w:sz w:val="24"/>
-        </w:rPr>
-        <w:t>config</w:t>
-      </w:r>
-      <w:proofErr w:type="spellEnd"/>
-      <w:r>
-        <w:rPr>
-          <w:b/>
-          <w:i/>
-          <w:sz w:val="24"/>
-        </w:rPr>
-        <w:t xml:space="preserve"> --global </w:t>
-      </w:r>
-      <w:proofErr w:type="spellStart"/>
-      <w:r>
-        <w:rPr>
-          <w:b/>
-          <w:i/>
-          <w:sz w:val="24"/>
-        </w:rPr>
-        <w:t>user.email</w:t>
-      </w:r>
-      <w:proofErr w:type="spellEnd"/>
+        <w:t>&gt;&gt; git config --global user.email</w:t>
+      </w:r>
     </w:p>
     <w:p>
       <w:pPr>
@@ -1255,47 +823,36 @@
           <w:b/>
           <w:sz w:val="24"/>
         </w:rPr>
-        <w:t xml:space="preserve">STEP 5: CREATE a new Repository on </w:t>
-      </w:r>
-      <w:proofErr w:type="spellStart"/>
-      <w:r>
-        <w:rPr>
-          <w:b/>
-          <w:sz w:val="24"/>
-        </w:rPr>
-        <w:t>GIthub</w:t>
-      </w:r>
-      <w:proofErr w:type="spellEnd"/>
-    </w:p>
-    <w:p>
-      <w:pPr>
-        <w:rPr>
-          <w:b/>
-          <w:sz w:val="24"/>
-        </w:rPr>
-      </w:pPr>
-      <w:r>
-        <w:rPr>
-          <w:b/>
-          <w:sz w:val="24"/>
-        </w:rPr>
-        <w:t xml:space="preserve">STEP 6: Open your folder and create file or </w:t>
-      </w:r>
-      <w:proofErr w:type="spellStart"/>
-      <w:r>
-        <w:rPr>
-          <w:b/>
-          <w:sz w:val="24"/>
-        </w:rPr>
-        <w:t>jupyter</w:t>
-      </w:r>
-      <w:proofErr w:type="spellEnd"/>
-      <w:r>
-        <w:rPr>
-          <w:b/>
-          <w:sz w:val="24"/>
-        </w:rPr>
-        <w:t xml:space="preserve"> notebook</w:t>
+        <w:t xml:space="preserve">STEP </w:t>
+      </w:r>
+      <w:r>
+        <w:rPr>
+          <w:b/>
+          <w:sz w:val="24"/>
+        </w:rPr>
+        <w:t>5: CREATE a new Repository on Gi</w:t>
+      </w:r>
+      <w:r>
+        <w:rPr>
+          <w:b/>
+          <w:sz w:val="24"/>
+        </w:rPr>
+        <w:t>thub</w:t>
+      </w:r>
+    </w:p>
+    <w:p>
+      <w:pPr>
+        <w:rPr>
+          <w:b/>
+          <w:sz w:val="24"/>
+        </w:rPr>
+      </w:pPr>
+      <w:r>
+        <w:rPr>
+          <w:b/>
+          <w:sz w:val="24"/>
+        </w:rPr>
+        <w:t>STEP 6: Open your folder and create file or jupyter notebook</w:t>
       </w:r>
     </w:p>
     <w:p>
@@ -1326,103 +883,13 @@
           <w:sz w:val="24"/>
         </w:rPr>
       </w:pPr>
-      <w:proofErr w:type="spellStart"/>
-      <w:r>
-        <w:rPr>
-          <w:b/>
-          <w:i/>
-          <w:sz w:val="24"/>
-        </w:rPr>
-        <w:t>git</w:t>
-      </w:r>
-      <w:proofErr w:type="spellEnd"/>
-      <w:r>
-        <w:rPr>
-          <w:b/>
-          <w:i/>
-          <w:sz w:val="24"/>
-        </w:rPr>
-        <w:t xml:space="preserve"> </w:t>
-      </w:r>
-      <w:proofErr w:type="spellStart"/>
-      <w:r>
-        <w:rPr>
-          <w:b/>
-          <w:i/>
-          <w:sz w:val="24"/>
-        </w:rPr>
-        <w:t>init</w:t>
-      </w:r>
-      <w:proofErr w:type="spellEnd"/>
-      <w:r>
-        <w:rPr>
-          <w:b/>
-          <w:i/>
-          <w:sz w:val="24"/>
-        </w:rPr>
-        <w:t xml:space="preserve"> (</w:t>
-      </w:r>
-      <w:proofErr w:type="spellStart"/>
-      <w:r>
-        <w:rPr>
-          <w:b/>
-          <w:i/>
-          <w:sz w:val="24"/>
-        </w:rPr>
-        <w:t>initalize</w:t>
-      </w:r>
-      <w:proofErr w:type="spellEnd"/>
-      <w:r>
-        <w:rPr>
-          <w:b/>
-          <w:i/>
-          <w:sz w:val="24"/>
-        </w:rPr>
-        <w:t>/</w:t>
-      </w:r>
-      <w:proofErr w:type="spellStart"/>
-      <w:r>
-        <w:rPr>
-          <w:b/>
-          <w:i/>
-          <w:sz w:val="24"/>
-        </w:rPr>
-        <w:t>reinitalize</w:t>
-      </w:r>
-      <w:proofErr w:type="spellEnd"/>
-      <w:r>
-        <w:rPr>
-          <w:b/>
-          <w:i/>
-          <w:sz w:val="24"/>
-        </w:rPr>
-        <w:t xml:space="preserve"> the </w:t>
-      </w:r>
-      <w:proofErr w:type="spellStart"/>
-      <w:r>
-        <w:rPr>
-          <w:b/>
-          <w:i/>
-          <w:sz w:val="24"/>
-        </w:rPr>
-        <w:t>git</w:t>
-      </w:r>
-      <w:proofErr w:type="spellEnd"/>
-      <w:r>
-        <w:rPr>
-          <w:b/>
-          <w:i/>
-          <w:sz w:val="24"/>
-        </w:rPr>
-        <w:t xml:space="preserve"> in your folder</w:t>
-      </w:r>
-      <w:r>
-        <w:rPr>
-          <w:b/>
-          <w:i/>
-          <w:sz w:val="24"/>
-        </w:rPr>
-        <w:t>)</w:t>
+      <w:r>
+        <w:rPr>
+          <w:b/>
+          <w:i/>
+          <w:sz w:val="24"/>
+        </w:rPr>
+        <w:t>git init (initalize/reinitalize the git in your folder)</w:t>
       </w:r>
     </w:p>
     <w:p>
@@ -1438,23 +905,13 @@
           <w:sz w:val="24"/>
         </w:rPr>
       </w:pPr>
-      <w:proofErr w:type="spellStart"/>
-      <w:r>
-        <w:rPr>
-          <w:b/>
-          <w:i/>
-          <w:sz w:val="24"/>
-        </w:rPr>
-        <w:t>git</w:t>
-      </w:r>
-      <w:proofErr w:type="spellEnd"/>
-      <w:r>
-        <w:rPr>
-          <w:b/>
-          <w:i/>
-          <w:sz w:val="24"/>
-        </w:rPr>
-        <w:t xml:space="preserve"> status (shows all untracked files)</w:t>
+      <w:r>
+        <w:rPr>
+          <w:b/>
+          <w:i/>
+          <w:sz w:val="24"/>
+        </w:rPr>
+        <w:t>git status (shows all untracked files)</w:t>
       </w:r>
     </w:p>
     <w:p>
@@ -1470,33 +927,13 @@
           <w:sz w:val="24"/>
         </w:rPr>
       </w:pPr>
-      <w:proofErr w:type="spellStart"/>
-      <w:proofErr w:type="gramStart"/>
-      <w:r>
-        <w:rPr>
-          <w:b/>
-          <w:i/>
-          <w:sz w:val="24"/>
-        </w:rPr>
-        <w:t>git</w:t>
-      </w:r>
-      <w:proofErr w:type="spellEnd"/>
-      <w:proofErr w:type="gramEnd"/>
-      <w:r>
-        <w:rPr>
-          <w:b/>
-          <w:i/>
-          <w:sz w:val="24"/>
-        </w:rPr>
-        <w:t xml:space="preserve"> add .</w:t>
-      </w:r>
-      <w:r>
-        <w:rPr>
-          <w:b/>
-          <w:i/>
-          <w:sz w:val="24"/>
-        </w:rPr>
-        <w:t xml:space="preserve"> ( to add file/files changes to be committed)</w:t>
+      <w:r>
+        <w:rPr>
+          <w:b/>
+          <w:i/>
+          <w:sz w:val="24"/>
+        </w:rPr>
+        <w:t>git add . ( to add file/files changes to be committed)</w:t>
       </w:r>
     </w:p>
     <w:p>
@@ -1512,41 +949,13 @@
           <w:sz w:val="24"/>
         </w:rPr>
       </w:pPr>
-      <w:proofErr w:type="spellStart"/>
-      <w:r>
-        <w:rPr>
-          <w:b/>
-          <w:i/>
-          <w:sz w:val="24"/>
-        </w:rPr>
-        <w:t>git</w:t>
-      </w:r>
-      <w:proofErr w:type="spellEnd"/>
-      <w:r>
-        <w:rPr>
-          <w:b/>
-          <w:i/>
-          <w:sz w:val="24"/>
-        </w:rPr>
-        <w:t xml:space="preserve"> commit -m "first commit" ( commit those added file/files using </w:t>
-      </w:r>
-      <w:proofErr w:type="spellStart"/>
-      <w:r>
-        <w:rPr>
-          <w:b/>
-          <w:i/>
-          <w:sz w:val="24"/>
-        </w:rPr>
-        <w:t>git</w:t>
-      </w:r>
-      <w:proofErr w:type="spellEnd"/>
-      <w:r>
-        <w:rPr>
-          <w:b/>
-          <w:i/>
-          <w:sz w:val="24"/>
-        </w:rPr>
-        <w:t xml:space="preserve"> add command)</w:t>
+      <w:r>
+        <w:rPr>
+          <w:b/>
+          <w:i/>
+          <w:sz w:val="24"/>
+        </w:rPr>
+        <w:t>git commit -m "first commit" ( commit those added file/files using git add command)</w:t>
       </w:r>
     </w:p>
     <w:p>
@@ -1562,23 +971,13 @@
           <w:sz w:val="24"/>
         </w:rPr>
       </w:pPr>
-      <w:proofErr w:type="spellStart"/>
-      <w:r>
-        <w:rPr>
-          <w:b/>
-          <w:i/>
-          <w:sz w:val="24"/>
-        </w:rPr>
-        <w:t>git</w:t>
-      </w:r>
-      <w:proofErr w:type="spellEnd"/>
-      <w:r>
-        <w:rPr>
-          <w:b/>
-          <w:i/>
-          <w:sz w:val="24"/>
-        </w:rPr>
-        <w:t xml:space="preserve"> branch -M main (rename the branch to "main" from "master")</w:t>
+      <w:r>
+        <w:rPr>
+          <w:b/>
+          <w:i/>
+          <w:sz w:val="24"/>
+        </w:rPr>
+        <w:t>git branch -M main (rename the branch to "main" from "master")</w:t>
       </w:r>
     </w:p>
     <w:p>
@@ -1594,41 +993,13 @@
           <w:sz w:val="24"/>
         </w:rPr>
       </w:pPr>
-      <w:proofErr w:type="spellStart"/>
-      <w:r>
-        <w:rPr>
-          <w:b/>
-          <w:i/>
-          <w:sz w:val="24"/>
-        </w:rPr>
-        <w:t>git</w:t>
-      </w:r>
-      <w:proofErr w:type="spellEnd"/>
-      <w:r>
-        <w:rPr>
-          <w:b/>
-          <w:i/>
-          <w:sz w:val="24"/>
-        </w:rPr>
-        <w:t xml:space="preserve"> remote add origin &lt;your-repo-</w:t>
-      </w:r>
-      <w:proofErr w:type="spellStart"/>
-      <w:r>
-        <w:rPr>
-          <w:b/>
-          <w:i/>
-          <w:sz w:val="24"/>
-        </w:rPr>
-        <w:t>url</w:t>
-      </w:r>
-      <w:proofErr w:type="spellEnd"/>
-      <w:r>
-        <w:rPr>
-          <w:b/>
-          <w:i/>
-          <w:sz w:val="24"/>
-        </w:rPr>
-        <w:t>&gt;</w:t>
+      <w:r>
+        <w:rPr>
+          <w:b/>
+          <w:i/>
+          <w:sz w:val="24"/>
+        </w:rPr>
+        <w:t>git remote add origin &lt;your-repo-url&gt;</w:t>
       </w:r>
     </w:p>
     <w:p>
@@ -1644,23 +1015,13 @@
           <w:sz w:val="24"/>
         </w:rPr>
       </w:pPr>
-      <w:proofErr w:type="spellStart"/>
-      <w:r>
-        <w:rPr>
-          <w:b/>
-          <w:i/>
-          <w:sz w:val="24"/>
-        </w:rPr>
-        <w:t>git</w:t>
-      </w:r>
-      <w:proofErr w:type="spellEnd"/>
-      <w:r>
-        <w:rPr>
-          <w:b/>
-          <w:i/>
-          <w:sz w:val="24"/>
-        </w:rPr>
-        <w:t xml:space="preserve"> push -u origin main</w:t>
+      <w:r>
+        <w:rPr>
+          <w:b/>
+          <w:i/>
+          <w:sz w:val="24"/>
+        </w:rPr>
+        <w:t>git push -u origin main</w:t>
       </w:r>
     </w:p>
     <w:p>
@@ -1691,26 +1052,16 @@
           <w:sz w:val="24"/>
         </w:rPr>
       </w:pPr>
-      <w:proofErr w:type="spellStart"/>
-      <w:proofErr w:type="gramStart"/>
-      <w:r>
-        <w:rPr>
-          <w:b/>
-          <w:i/>
-          <w:sz w:val="24"/>
-        </w:rPr>
-        <w:t>git</w:t>
-      </w:r>
-      <w:proofErr w:type="spellEnd"/>
-      <w:proofErr w:type="gramEnd"/>
-      <w:r>
-        <w:rPr>
-          <w:b/>
-          <w:i/>
-          <w:sz w:val="24"/>
-        </w:rPr>
-        <w:t xml:space="preserve"> add .</w:t>
-      </w:r>
+      <w:r>
+        <w:rPr>
+          <w:b/>
+          <w:i/>
+          <w:sz w:val="24"/>
+        </w:rPr>
+        <w:t>git status</w:t>
+      </w:r>
+      <w:bookmarkStart w:id="0" w:name="_GoBack"/>
+      <w:bookmarkEnd w:id="0"/>
     </w:p>
     <w:p>
       <w:pPr>
@@ -1725,23 +1076,13 @@
           <w:sz w:val="24"/>
         </w:rPr>
       </w:pPr>
-      <w:proofErr w:type="spellStart"/>
-      <w:r>
-        <w:rPr>
-          <w:b/>
-          <w:i/>
-          <w:sz w:val="24"/>
-        </w:rPr>
-        <w:t>git</w:t>
-      </w:r>
-      <w:proofErr w:type="spellEnd"/>
-      <w:r>
-        <w:rPr>
-          <w:b/>
-          <w:i/>
-          <w:sz w:val="24"/>
-        </w:rPr>
-        <w:t xml:space="preserve"> commit –m “Describe your changes”</w:t>
+      <w:r>
+        <w:rPr>
+          <w:b/>
+          <w:i/>
+          <w:sz w:val="24"/>
+        </w:rPr>
+        <w:t>git add .</w:t>
       </w:r>
     </w:p>
     <w:p>
@@ -1757,23 +1098,35 @@
           <w:sz w:val="24"/>
         </w:rPr>
       </w:pPr>
-      <w:proofErr w:type="spellStart"/>
-      <w:r>
-        <w:rPr>
-          <w:b/>
-          <w:i/>
-          <w:sz w:val="24"/>
-        </w:rPr>
-        <w:t>git</w:t>
-      </w:r>
-      <w:proofErr w:type="spellEnd"/>
-      <w:r>
-        <w:rPr>
-          <w:b/>
-          <w:i/>
-          <w:sz w:val="24"/>
-        </w:rPr>
-        <w:t xml:space="preserve"> push origin main</w:t>
+      <w:r>
+        <w:rPr>
+          <w:b/>
+          <w:i/>
+          <w:sz w:val="24"/>
+        </w:rPr>
+        <w:t>git commit –m “Describe your changes”</w:t>
+      </w:r>
+    </w:p>
+    <w:p>
+      <w:pPr>
+        <w:pStyle w:val="ListParagraph"/>
+        <w:numPr>
+          <w:ilvl w:val="0"/>
+          <w:numId w:val="5"/>
+        </w:numPr>
+        <w:rPr>
+          <w:b/>
+          <w:i/>
+          <w:sz w:val="24"/>
+        </w:rPr>
+      </w:pPr>
+      <w:r>
+        <w:rPr>
+          <w:b/>
+          <w:i/>
+          <w:sz w:val="24"/>
+        </w:rPr>
+        <w:t>git push origin main</w:t>
       </w:r>
     </w:p>
     <w:sectPr>

</xml_diff>